<commit_message>
Physik issue for report:36
</commit_message>
<xml_diff>
--- a/template/BP 2016/BP2016_GMS_Abschlusszeugnis_KL10_RSA.docx
+++ b/template/BP 2016/BP2016_GMS_Abschlusszeugnis_KL10_RSA.docx
@@ -324,7 +324,7 @@
                 <w:b/>
                 <w:sz w:val="26"/>
               </w:rPr>
-              <w:instrText xml:space="preserve"> FORMTEXT </w:instrText>
+              <w:instrText xml:space="preserve">FORMTEXT</w:instrText>
             </w:r>
             <w:r>
               <w:rPr>
@@ -494,7 +494,7 @@
                 <w:spacing w:val="-2"/>
                 <w:sz w:val="20"/>
               </w:rPr>
-              <w:instrText xml:space="preserve"> FORMTEXT </w:instrText>
+              <w:instrText xml:space="preserve">FORMTEXT</w:instrText>
             </w:r>
             <w:r>
               <w:rPr>
@@ -611,7 +611,7 @@
                 <w:spacing w:val="-2"/>
                 <w:sz w:val="20"/>
               </w:rPr>
-              <w:instrText xml:space="preserve"> FORMTEXT </w:instrText>
+              <w:instrText xml:space="preserve">FORMTEXT</w:instrText>
             </w:r>
             <w:r>
               <w:rPr>
@@ -728,7 +728,7 @@
                 <w:spacing w:val="-2"/>
                 <w:sz w:val="20"/>
               </w:rPr>
-              <w:instrText xml:space="preserve"> FORMTEXT </w:instrText>
+              <w:instrText xml:space="preserve">FORMTEXT</w:instrText>
             </w:r>
             <w:r>
               <w:rPr>
@@ -796,7 +796,7 @@
                 <w:sz w:val="20"/>
                 <w:szCs w:val="20"/>
               </w:rPr>
-              <w:t xml:space="preserve">Schriftliche Prüfungsfächer waren: </w:t>
+              <w:t xml:space="preserve">Schriftliche Prüfungsfächer waren:</w:t>
             </w:r>
             <w:r>
               <w:rPr>
@@ -818,7 +818,7 @@
                 <w:sz w:val="20"/>
                 <w:szCs w:val="20"/>
               </w:rPr>
-              <w:t xml:space="preserve">, </w:t>
+              <w:t xml:space="preserve">,</w:t>
             </w:r>
             <w:sdt>
               <w:sdtPr>
@@ -1053,7 +1053,7 @@
                 <w:sz w:val="20"/>
                 <w:szCs w:val="20"/>
               </w:rPr>
-              <w:t xml:space="preserve">Physik </w:t>
+              <w:t>Physik</w:t>
             </w:r>
           </w:p>
         </w:tc>
@@ -2534,7 +2534,7 @@
                 <w:sz w:val="20"/>
                 <w:szCs w:val="20"/>
               </w:rPr>
-              <w:t xml:space="preserve">Englisch: </w:t>
+              <w:t xml:space="preserve">Englisch:</w:t>
             </w:r>
             <w:r>
               <w:rPr>
@@ -2560,7 +2560,7 @@
                 <w:sz w:val="20"/>
                 <w:szCs w:val="20"/>
               </w:rPr>
-              <w:instrText xml:space="preserve"> FORMTEXT </w:instrText>
+              <w:instrText xml:space="preserve">FORMTEXT</w:instrText>
             </w:r>
             <w:r>
               <w:rPr>
@@ -2601,7 +2601,7 @@
                 <w:sz w:val="20"/>
                 <w:szCs w:val="20"/>
               </w:rPr>
-              <w:t xml:space="preserve">          </w:t>
+              <w:t xml:space="preserve"/>
             </w:r>
             <w:sdt>
               <w:sdtPr>
@@ -2642,7 +2642,7 @@
                 <w:sz w:val="20"/>
                 <w:szCs w:val="20"/>
               </w:rPr>
-              <w:t xml:space="preserve"> </w:t>
+              <w:t xml:space="preserve"/>
             </w:r>
             <w:r>
               <w:rPr>
@@ -2668,7 +2668,7 @@
                 <w:sz w:val="20"/>
                 <w:szCs w:val="20"/>
               </w:rPr>
-              <w:instrText xml:space="preserve"> FORMTEXT </w:instrText>
+              <w:instrText xml:space="preserve">FORMTEXT</w:instrText>
             </w:r>
             <w:r>
               <w:rPr>
@@ -2709,7 +2709,7 @@
                 <w:sz w:val="20"/>
                 <w:szCs w:val="20"/>
               </w:rPr>
-              <w:t xml:space="preserve">          </w:t>
+              <w:t xml:space="preserve"/>
             </w:r>
             <w:sdt>
               <w:sdtPr>
@@ -2750,7 +2750,7 @@
                 <w:sz w:val="20"/>
                 <w:szCs w:val="20"/>
               </w:rPr>
-              <w:t xml:space="preserve"> </w:t>
+              <w:t xml:space="preserve"/>
             </w:r>
             <w:r>
               <w:rPr>
@@ -2776,7 +2776,7 @@
                 <w:sz w:val="20"/>
                 <w:szCs w:val="20"/>
               </w:rPr>
-              <w:instrText xml:space="preserve"> FORMTEXT </w:instrText>
+              <w:instrText xml:space="preserve">FORMTEXT</w:instrText>
             </w:r>
             <w:r>
               <w:rPr>
@@ -2817,7 +2817,7 @@
                 <w:sz w:val="20"/>
                 <w:szCs w:val="20"/>
               </w:rPr>
-              <w:t xml:space="preserve">         </w:t>
+              <w:t xml:space="preserve"/>
             </w:r>
           </w:p>
         </w:tc>
@@ -2902,7 +2902,7 @@
                 <w:sz w:val="20"/>
                 <w:szCs w:val="20"/>
               </w:rPr>
-              <w:instrText xml:space="preserve"> FORMTEXT </w:instrText>
+              <w:instrText xml:space="preserve">FORMTEXT</w:instrText>
             </w:r>
             <w:r>
               <w:rPr>
@@ -2942,7 +2942,7 @@
                 <w:sz w:val="20"/>
                 <w:szCs w:val="20"/>
               </w:rPr>
-              <w:t xml:space="preserve"> </w:t>
+              <w:t xml:space="preserve"/>
             </w:r>
             <w:r>
               <w:rPr>
@@ -3107,7 +3107,7 @@
                 <w:rFonts w:cs="Arial"/>
                 <w:sz w:val="20"/>
               </w:rPr>
-              <w:instrText xml:space="preserve"> FORMTEXT </w:instrText>
+              <w:instrText xml:space="preserve">FORMTEXT</w:instrText>
             </w:r>
             <w:r>
               <w:rPr>
@@ -3224,7 +3224,7 @@
               <w:rPr>
                 <w:sz w:val="20"/>
               </w:rPr>
-              <w:instrText xml:space="preserve"> FORMTEXT </w:instrText>
+              <w:instrText xml:space="preserve">FORMTEXT</w:instrText>
             </w:r>
             <w:r>
               <w:rPr>
@@ -3287,7 +3287,7 @@
                 <w:rFonts w:cs="Arial"/>
                 <w:sz w:val="20"/>
               </w:rPr>
-              <w:t xml:space="preserve">:   </w:t>
+              <w:t xml:space="preserve">:</w:t>
             </w:r>
             <w:r>
               <w:rPr>
@@ -3311,7 +3311,7 @@
                 <w:rFonts w:cs="Arial"/>
                 <w:sz w:val="20"/>
               </w:rPr>
-              <w:instrText xml:space="preserve"> FORMTEXT </w:instrText>
+              <w:instrText xml:space="preserve">FORMTEXT</w:instrText>
             </w:r>
             <w:r>
               <w:rPr>
@@ -3424,7 +3424,7 @@
                 <w:sz w:val="12"/>
                 <w:szCs w:val="12"/>
               </w:rPr>
-              <w:t xml:space="preserve">der </w:t>
+              <w:t xml:space="preserve">der</w:t>
             </w:r>
             <w:r>
               <w:rPr>
@@ -3735,7 +3735,7 @@
                 <w:sz w:val="12"/>
                 <w:szCs w:val="12"/>
               </w:rPr>
-              <w:t xml:space="preserve"> </w:t>
+              <w:t xml:space="preserve"/>
             </w:r>
             <w:r>
               <w:rPr>
@@ -3784,7 +3784,7 @@
                 <w:sz w:val="12"/>
                 <w:szCs w:val="12"/>
               </w:rPr>
-              <w:t xml:space="preserve"> </w:t>
+              <w:t xml:space="preserve"/>
             </w:r>
             <w:r>
               <w:rPr>
@@ -3823,7 +3823,7 @@
                 <w:sz w:val="12"/>
                 <w:szCs w:val="12"/>
               </w:rPr>
-              <w:t xml:space="preserve"> </w:t>
+              <w:t xml:space="preserve"/>
             </w:r>
             <w:r>
               <w:rPr>
@@ -3862,7 +3862,7 @@
                 <w:sz w:val="12"/>
                 <w:szCs w:val="12"/>
               </w:rPr>
-              <w:t xml:space="preserve"> </w:t>
+              <w:t xml:space="preserve"/>
             </w:r>
             <w:r>
               <w:rPr>
@@ -3891,7 +3891,7 @@
                 <w:sz w:val="12"/>
                 <w:szCs w:val="12"/>
               </w:rPr>
-              <w:t xml:space="preserve"> </w:t>
+              <w:t xml:space="preserve"/>
             </w:r>
             <w:r>
               <w:rPr>
@@ -3940,7 +3940,7 @@
                 <w:sz w:val="12"/>
                 <w:szCs w:val="12"/>
               </w:rPr>
-              <w:t xml:space="preserve"> </w:t>
+              <w:t xml:space="preserve"/>
             </w:r>
             <w:r>
               <w:rPr>
@@ -4047,7 +4047,7 @@
                 <w:sz w:val="12"/>
                 <w:szCs w:val="12"/>
               </w:rPr>
-              <w:t xml:space="preserve"> </w:t>
+              <w:t xml:space="preserve"/>
             </w:r>
             <w:r>
               <w:rPr>
@@ -4086,7 +4086,7 @@
                 <w:sz w:val="12"/>
                 <w:szCs w:val="12"/>
               </w:rPr>
-              <w:t xml:space="preserve"> </w:t>
+              <w:t xml:space="preserve"/>
             </w:r>
             <w:r>
               <w:rPr>
@@ -4183,7 +4183,7 @@
                 <w:sz w:val="12"/>
                 <w:szCs w:val="12"/>
               </w:rPr>
-              <w:t xml:space="preserve"> </w:t>
+              <w:t xml:space="preserve"/>
             </w:r>
             <w:r>
               <w:rPr>
@@ -4222,7 +4222,7 @@
                 <w:sz w:val="12"/>
                 <w:szCs w:val="12"/>
               </w:rPr>
-              <w:t xml:space="preserve"> </w:t>
+              <w:t xml:space="preserve"/>
             </w:r>
             <w:r>
               <w:rPr>
@@ -4291,7 +4291,7 @@
                 <w:sz w:val="12"/>
                 <w:szCs w:val="12"/>
               </w:rPr>
-              <w:t xml:space="preserve"> </w:t>
+              <w:t xml:space="preserve"/>
             </w:r>
             <w:r>
               <w:rPr>
@@ -4330,7 +4330,7 @@
                 <w:sz w:val="12"/>
                 <w:szCs w:val="12"/>
               </w:rPr>
-              <w:t xml:space="preserve"> </w:t>
+              <w:t xml:space="preserve"/>
             </w:r>
             <w:r>
               <w:rPr>
@@ -4399,7 +4399,7 @@
                 <w:sz w:val="12"/>
                 <w:szCs w:val="12"/>
               </w:rPr>
-              <w:t xml:space="preserve"> </w:t>
+              <w:t xml:space="preserve"/>
             </w:r>
             <w:r>
               <w:rPr>
@@ -4487,7 +4487,7 @@
                 <w:sz w:val="12"/>
                 <w:szCs w:val="12"/>
               </w:rPr>
-              <w:t xml:space="preserve">Entsprechend dem Gemeinsamen Europäischen </w:t>
+              <w:t xml:space="preserve">Entsprechend dem Gemeinsamen Europäischen</w:t>
             </w:r>
             <w:r>
               <w:rPr>
@@ -4505,7 +4505,7 @@
                 <w:sz w:val="12"/>
                 <w:szCs w:val="12"/>
               </w:rPr>
-              <w:t xml:space="preserve"> (GER)</w:t>
+              <w:t xml:space="preserve">(GER)</w:t>
             </w:r>
           </w:p>
         </w:tc>

</xml_diff>